<commit_message>
Add data-extraction & pre-processing section to methods doc
Section 1 now covers TIGER/OSM sources (Overpass pilot vs Geofabrik
pbf path), county-buffered walk-graph extraction, tract truncation,
and the per-stage pre-processing conventions.

Co-Authored-By: Claude Fable 5 <noreply@anthropic.com>
</commit_message>
<xml_diff>
--- a/docs/METHODS_UOI.docx
+++ b/docs/METHODS_UOI.docx
@@ -363,13 +363,456 @@
       </w:tr>
     </w:tbl>
     <w:bookmarkEnd w:id="20"/>
-    <w:bookmarkStart w:id="21" w:name="uoi-지표-6개-stage-2"/>
+    <w:bookmarkStart w:id="24" w:name="데이터-추출-및-전처리-stage-1"/>
     <w:p>
       <w:pPr>
         <w:pStyle w:val="Heading1"/>
       </w:pPr>
       <w:r>
-        <w:t xml:space="preserve">1. UOI 지표 6개 (Stage 2)</w:t>
+        <w:t xml:space="preserve">1. 데이터 추출 및 전처리 (Stage 1)</w:t>
+      </w:r>
+    </w:p>
+    <w:bookmarkStart w:id="21" w:name="데이터-소스"/>
+    <w:p>
+      <w:pPr>
+        <w:pStyle w:val="Heading2"/>
+      </w:pPr>
+      <w:r>
+        <w:t xml:space="preserve">1.1 데이터 소스</w:t>
+      </w:r>
+    </w:p>
+    <w:p>
+      <w:pPr>
+        <w:pStyle w:val="Compact"/>
+        <w:numPr>
+          <w:ilvl w:val="0"/>
+          <w:numId w:val="1001"/>
+        </w:numPr>
+      </w:pPr>
+      <w:r>
+        <w:rPr>
+          <w:b/>
+          <w:bCs/>
+        </w:rPr>
+        <w:t xml:space="preserve">Census TIGER/Line (2024 vintage)</w:t>
+      </w:r>
+      <w:r>
+        <w:t xml:space="preserve"> — 주(state)별 census tract 경계 shapefile을 다운로드하여 GEOID(11자리), 토지면적 ALAND, 수역면적 AWATER, 폴리곤 geometry를 추출한다 (EPSG:4326). Tract 속성은 </w:t>
+      </w:r>
+      <w:r>
+        <w:rPr>
+          <w:rStyle w:val="VerbatimChar"/>
+        </w:rPr>
+        <w:t xml:space="preserve">tracts_{state}.gpkg</w:t>
+      </w:r>
+      <w:r>
+        <w:t xml:space="preserve">로 저장되어 이후 모든 단계(면적 정규화, MCMC 폴리곤 제약, 패널 조인)에서 재사용된다.</w:t>
+      </w:r>
+    </w:p>
+    <w:p>
+      <w:pPr>
+        <w:pStyle w:val="Compact"/>
+        <w:numPr>
+          <w:ilvl w:val="0"/>
+          <w:numId w:val="1001"/>
+        </w:numPr>
+      </w:pPr>
+      <w:r>
+        <w:rPr>
+          <w:b/>
+          <w:bCs/>
+        </w:rPr>
+        <w:t xml:space="preserve">OpenStreetMap 보행 네트워크</w:t>
+      </w:r>
+      <w:r>
+        <w:t xml:space="preserve"> — 두 가지 추출 경로:</w:t>
+      </w:r>
+    </w:p>
+    <w:p>
+      <w:pPr>
+        <w:pStyle w:val="Compact"/>
+        <w:numPr>
+          <w:ilvl w:val="1"/>
+          <w:numId w:val="1002"/>
+        </w:numPr>
+      </w:pPr>
+      <w:r>
+        <w:rPr>
+          <w:i/>
+          <w:iCs/>
+        </w:rPr>
+        <w:t xml:space="preserve">Overpass API</w:t>
+      </w:r>
+      <w:r>
+        <w:t xml:space="preserve"> (파일럿): county 단위 쿼리 후 로컬 분할. 전국 기준 tract별 쿼리 84,414회 대신 county별 ~3,200회로 API 부하를 낮춘다.</w:t>
+      </w:r>
+    </w:p>
+    <w:p>
+      <w:pPr>
+        <w:pStyle w:val="Compact"/>
+        <w:numPr>
+          <w:ilvl w:val="1"/>
+          <w:numId w:val="1002"/>
+        </w:numPr>
+      </w:pPr>
+      <w:r>
+        <w:rPr>
+          <w:i/>
+          <w:iCs/>
+        </w:rPr>
+        <w:t xml:space="preserve">Geofabrik state </w:t>
+      </w:r>
+      <w:r>
+        <w:rPr>
+          <w:rStyle w:val="VerbatimChar"/>
+          <w:i/>
+          <w:iCs/>
+        </w:rPr>
+        <w:t xml:space="preserve">.pbf</w:t>
+      </w:r>
+      <w:r>
+        <w:t xml:space="preserve"> (전국 스케일, 기본): 주별 </w:t>
+      </w:r>
+      <w:r>
+        <w:rPr>
+          <w:rStyle w:val="VerbatimChar"/>
+        </w:rPr>
+        <w:t xml:space="preserve">.pbf</w:t>
+      </w:r>
+      <w:r>
+        <w:t xml:space="preserve"> extract를 내려받아 pyrosm으로 로컬 파싱. 대형 주의 전체 walk 그래프는 700만+ 노드로 메모리 초과가 나므로, </w:t>
+      </w:r>
+      <w:r>
+        <w:rPr>
+          <w:b/>
+          <w:bCs/>
+        </w:rPr>
+        <w:t xml:space="preserve">county 단위로</w:t>
+      </w:r>
+      <w:r>
+        <w:t xml:space="preserve"> 해당 county bbox만 파싱하여 peak memory를 제한한다.</w:t>
+      </w:r>
+    </w:p>
+    <w:p>
+      <w:pPr>
+        <w:pStyle w:val="Compact"/>
+        <w:numPr>
+          <w:ilvl w:val="0"/>
+          <w:numId w:val="1001"/>
+        </w:numPr>
+      </w:pPr>
+      <w:r>
+        <w:rPr>
+          <w:b/>
+          <w:bCs/>
+        </w:rPr>
+        <w:t xml:space="preserve">외부 사회경제 데이터</w:t>
+      </w:r>
+      <w:r>
+        <w:t xml:space="preserve"> (Stage 8에서 조인): Opportunity Atlas(경제 이동성·수감률), Eviction Lab(강제퇴거율, 2014–18 평균), FARS(보행자 사망 사고 2017–21, 좌표 spatial join), LODES8(일자리 수·안정 일자리 비율), ACS 5-year(인구, 소득, 인종, 학력, walk-to-work share).</w:t>
+      </w:r>
+    </w:p>
+    <w:bookmarkEnd w:id="21"/>
+    <w:bookmarkStart w:id="22" w:name="네트워크-추출-절차"/>
+    <w:p>
+      <w:pPr>
+        <w:pStyle w:val="Heading2"/>
+      </w:pPr>
+      <w:r>
+        <w:t xml:space="preserve">1.2 네트워크 추출 절차</w:t>
+      </w:r>
+    </w:p>
+    <w:p>
+      <w:pPr>
+        <w:pStyle w:val="Compact"/>
+        <w:numPr>
+          <w:ilvl w:val="0"/>
+          <w:numId w:val="1003"/>
+        </w:numPr>
+      </w:pPr>
+      <w:r>
+        <w:rPr>
+          <w:b/>
+          <w:bCs/>
+        </w:rPr>
+        <w:t xml:space="preserve">County 폴리곤 구성</w:t>
+      </w:r>
+      <w:r>
+        <w:t xml:space="preserve">: county 내 tract 폴리곤의 union을 UTM으로 투영해 </w:t>
+      </w:r>
+      <w:r>
+        <w:rPr>
+          <w:b/>
+          <w:bCs/>
+        </w:rPr>
+        <w:t xml:space="preserve">300 m 버퍼</w:t>
+      </w:r>
+      <w:r>
+        <w:t xml:space="preserve">를 적용한다 — county 경계에 걸친 도로가 잘려나가 경계부 tract의 지표가 왜곡되는 것을 방지.</w:t>
+      </w:r>
+    </w:p>
+    <w:p>
+      <w:pPr>
+        <w:pStyle w:val="Compact"/>
+        <w:numPr>
+          <w:ilvl w:val="0"/>
+          <w:numId w:val="1003"/>
+        </w:numPr>
+      </w:pPr>
+      <w:r>
+        <w:rPr>
+          <w:b/>
+          <w:bCs/>
+        </w:rPr>
+        <w:t xml:space="preserve">보행 그래프 생성</w:t>
+      </w:r>
+      <w:r>
+        <w:t xml:space="preserve">: OSMnx </w:t>
+      </w:r>
+      <w:r>
+        <w:rPr>
+          <w:rStyle w:val="VerbatimChar"/>
+        </w:rPr>
+        <w:t xml:space="preserve">network_type="walk"</w:t>
+      </w:r>
+      <w:r>
+        <w:t xml:space="preserve"> 필터로 보행 가능 도로만 취하고(</w:t>
+      </w:r>
+      <w:r>
+        <w:rPr>
+          <w:rStyle w:val="VerbatimChar"/>
+        </w:rPr>
+        <w:t xml:space="preserve">retain_all=True</w:t>
+      </w:r>
+      <w:r>
+        <w:t xml:space="preserve">, </w:t>
+      </w:r>
+      <w:r>
+        <w:rPr>
+          <w:rStyle w:val="VerbatimChar"/>
+        </w:rPr>
+        <w:t xml:space="preserve">truncate_by_edge=True</w:t>
+      </w:r>
+      <w:r>
+        <w:t xml:space="preserve">), OSM boolean 태그(</w:t>
+      </w:r>
+      <w:r>
+        <w:rPr>
+          <w:rStyle w:val="VerbatimChar"/>
+        </w:rPr>
+        <w:t xml:space="preserve">oneway</w:t>
+      </w:r>
+      <w:r>
+        <w:t xml:space="preserve">, </w:t>
+      </w:r>
+      <w:r>
+        <w:rPr>
+          <w:rStyle w:val="VerbatimChar"/>
+        </w:rPr>
+        <w:t xml:space="preserve">reversed</w:t>
+      </w:r>
+      <w:r>
+        <w:t xml:space="preserve">)를 정규화한 뒤 </w:t>
+      </w:r>
+      <w:r>
+        <w:rPr>
+          <w:b/>
+          <w:bCs/>
+        </w:rPr>
+        <w:t xml:space="preserve">위상 단순화</w:t>
+      </w:r>
+      <w:r>
+        <w:t xml:space="preserve">(</w:t>
+      </w:r>
+      <w:r>
+        <w:rPr>
+          <w:rStyle w:val="VerbatimChar"/>
+        </w:rPr>
+        <w:t xml:space="preserve">simplify_graph</w:t>
+      </w:r>
+      <w:r>
+        <w:t xml:space="preserve">)로 교차로-간 세그먼트 토폴로지로 축약한다.</w:t>
+      </w:r>
+    </w:p>
+    <w:p>
+      <w:pPr>
+        <w:pStyle w:val="Compact"/>
+        <w:numPr>
+          <w:ilvl w:val="0"/>
+          <w:numId w:val="1003"/>
+        </w:numPr>
+      </w:pPr>
+      <w:r>
+        <w:rPr>
+          <w:b/>
+          <w:bCs/>
+        </w:rPr>
+        <w:t xml:space="preserve">Tract 분할</w:t>
+      </w:r>
+      <w:r>
+        <w:t xml:space="preserve">: county 그래프를 tract 폴리곤별 부분그래프로 자른다. 규칙은 truncate-by-edge — 폴리곤 내부 노드와 그 직접 이웃 노드를 포함시켜 경계를 가로지르는 엣지를 보존한다. county 전체에 공간 인덱스(R-tree)를 한 번 구축해 tract별 비용이 그래프 전체가 아닌 근방 노드 수에 비례하게 한다. 결과는 tract별 </w:t>
+      </w:r>
+      <w:r>
+        <w:rPr>
+          <w:rStyle w:val="VerbatimChar"/>
+        </w:rPr>
+        <w:t xml:space="preserve">{GEOID}.graphml</w:t>
+      </w:r>
+      <w:r>
+        <w:t xml:space="preserve">.</w:t>
+      </w:r>
+    </w:p>
+    <w:p>
+      <w:pPr>
+        <w:pStyle w:val="Compact"/>
+        <w:numPr>
+          <w:ilvl w:val="0"/>
+          <w:numId w:val="1003"/>
+        </w:numPr>
+      </w:pPr>
+      <w:r>
+        <w:rPr>
+          <w:b/>
+          <w:bCs/>
+        </w:rPr>
+        <w:t xml:space="preserve">견고성</w:t>
+      </w:r>
+      <w:r>
+        <w:t xml:space="preserve">: 모든 단계는 재개 가능(이미 추출된 tract 스킵)하고, 도로가 없는 tract(수역·공원 등)나 county 단위 실패는 </w:t>
+      </w:r>
+      <w:r>
+        <w:rPr>
+          <w:rStyle w:val="VerbatimChar"/>
+        </w:rPr>
+        <w:t xml:space="preserve">extract_log.csv</w:t>
+      </w:r>
+      <w:r>
+        <w:t xml:space="preserve">에 기록하되 전체 실행을 중단시키지 않는다. 메가-county는 별도 프로세스로 격리해 OOM이 주 전체를 막지 못하게 한다.</w:t>
+      </w:r>
+    </w:p>
+    <w:bookmarkEnd w:id="22"/>
+    <w:bookmarkStart w:id="23" w:name="전처리-분석-전-공통-처리"/>
+    <w:p>
+      <w:pPr>
+        <w:pStyle w:val="Heading2"/>
+      </w:pPr>
+      <w:r>
+        <w:t xml:space="preserve">1.3 전처리 (분석 전 공통 처리)</w:t>
+      </w:r>
+    </w:p>
+    <w:p>
+      <w:pPr>
+        <w:pStyle w:val="Compact"/>
+        <w:numPr>
+          <w:ilvl w:val="0"/>
+          <w:numId w:val="1004"/>
+        </w:numPr>
+      </w:pPr>
+      <w:r>
+        <w:rPr>
+          <w:b/>
+          <w:bCs/>
+        </w:rPr>
+        <w:t xml:space="preserve">지표 계산용 (Stage 2)</w:t>
+      </w:r>
+      <w:r>
+        <w:t xml:space="preserve">: 그래프를 투영 CRS로 변환 후 무향화한다. 노드 차수로 교차로(</w:t>
+      </w:r>
+      <m:oMath>
+        <m:r>
+          <m:rPr>
+            <m:sty m:val="p"/>
+          </m:rPr>
+          <m:t>deg≥</m:t>
+        </m:r>
+        <m:r>
+          <m:t>3</m:t>
+        </m:r>
+      </m:oMath>
+      <w:r>
+        <w:t xml:space="preserve">)와 막다른길(</w:t>
+      </w:r>
+      <m:oMath>
+        <m:r>
+          <m:rPr>
+            <m:sty m:val="p"/>
+          </m:rPr>
+          <m:t>deg=</m:t>
+        </m:r>
+        <m:r>
+          <m:t>1</m:t>
+        </m:r>
+      </m:oMath>
+      <w:r>
+        <w:t xml:space="preserve">)을 분류하며, 노드 5개 미만의 tract는 </w:t>
+      </w:r>
+      <w:r>
+        <w:rPr>
+          <w:rStyle w:val="VerbatimChar"/>
+        </w:rPr>
+        <w:t xml:space="preserve">too_small</w:t>
+      </w:r>
+      <w:r>
+        <w:t xml:space="preserve">로 제외한다.</w:t>
+      </w:r>
+    </w:p>
+    <w:p>
+      <w:pPr>
+        <w:pStyle w:val="Compact"/>
+        <w:numPr>
+          <w:ilvl w:val="0"/>
+          <w:numId w:val="1004"/>
+        </w:numPr>
+      </w:pPr>
+      <w:r>
+        <w:rPr>
+          <w:b/>
+          <w:bCs/>
+        </w:rPr>
+        <w:t xml:space="preserve">MCMC 상태 초기화용 (Stage 4–5)</w:t>
+      </w:r>
+      <w:r>
+        <w:t xml:space="preserve">: 투영 무향 </w:t>
+      </w:r>
+      <w:r>
+        <w:rPr>
+          <w:b/>
+          <w:bCs/>
+        </w:rPr>
+        <w:t xml:space="preserve">단순 그래프</w:t>
+      </w:r>
+      <w:r>
+        <w:t xml:space="preserve">로 변환 — self-loop 제거, 최대 연결 성분만 유지, 곡선 geometry를 직선 엣지로 추상화하고 길이를 유클리드 거리로 재계산한다(실제 네트워크도 동일 추상화로 재채점하여 비교 공정성 유지). Tract 폴리곤은 20 m 버퍼를 적용해 노드 제약 영역으로 쓴다.</w:t>
+      </w:r>
+    </w:p>
+    <w:p>
+      <w:pPr>
+        <w:pStyle w:val="Compact"/>
+        <w:numPr>
+          <w:ilvl w:val="0"/>
+          <w:numId w:val="1004"/>
+        </w:numPr>
+      </w:pPr>
+      <w:r>
+        <w:rPr>
+          <w:b/>
+          <w:bCs/>
+        </w:rPr>
+        <w:t xml:space="preserve">패널 구축용 (Stage 8b)</w:t>
+      </w:r>
+      <w:r>
+        <w:t xml:space="preserve">: 모든 외부 데이터를 11자리 GEOID로 표준화해 조인한다(FARS는 사고 좌표를 tract 폴리곤에 spatial join). ALAND를 km²로 환산해 인구밀도·일자리밀도의 분모로 쓰고, 파일럿/중복 레이어는 제거한다.</w:t>
+      </w:r>
+    </w:p>
+    <w:bookmarkEnd w:id="23"/>
+    <w:bookmarkEnd w:id="24"/>
+    <w:bookmarkStart w:id="25" w:name="uoi-지표-6개-stage-2"/>
+    <w:p>
+      <w:pPr>
+        <w:pStyle w:val="Heading1"/>
+      </w:pPr>
+      <w:r>
+        <w:t xml:space="preserve">2. UOI 지표 6개 (Stage 2)</w:t>
       </w:r>
     </w:p>
     <w:p>
@@ -1235,14 +1678,14 @@
         </m:oMath>
       </m:oMathPara>
     </w:p>
-    <w:bookmarkEnd w:id="21"/>
-    <w:bookmarkStart w:id="22" w:name="composite-uoi-score-stage-3"/>
+    <w:bookmarkEnd w:id="25"/>
+    <w:bookmarkStart w:id="26" w:name="composite-uoi-score-stage-3"/>
     <w:p>
       <w:pPr>
         <w:pStyle w:val="Heading1"/>
       </w:pPr>
       <w:r>
-        <w:t xml:space="preserve">2. Composite UOI score (Stage 3)</w:t>
+        <w:t xml:space="preserve">3. Composite UOI score (Stage 3)</w:t>
       </w:r>
     </w:p>
     <w:p>
@@ -1391,14 +1834,14 @@
         <w:t xml:space="preserve"> — 은 단일 점수로 합치지 않고 Pareto frontier만 표시한다.)</w:t>
       </w:r>
     </w:p>
-    <w:bookmarkEnd w:id="22"/>
-    <w:bookmarkStart w:id="23" w:name="rj-mcmc-반사실-네트워크-탐색-stage-45"/>
+    <w:bookmarkEnd w:id="26"/>
+    <w:bookmarkStart w:id="27" w:name="rj-mcmc-반사실-네트워크-탐색-stage-45"/>
     <w:p>
       <w:pPr>
         <w:pStyle w:val="Heading1"/>
       </w:pPr>
       <w:r>
-        <w:t xml:space="preserve">3. RJ-MCMC 반사실 네트워크 탐색 (Stage 4–5)</w:t>
+        <w:t xml:space="preserve">4. RJ-MCMC 반사실 네트워크 탐색 (Stage 4–5)</w:t>
       </w:r>
     </w:p>
     <w:p>
@@ -2132,7 +2575,7 @@
         <w:pStyle w:val="Compact"/>
         <w:numPr>
           <w:ilvl w:val="0"/>
-          <w:numId w:val="1001"/>
+          <w:numId w:val="1005"/>
         </w:numPr>
       </w:pPr>
       <w:r>
@@ -2208,7 +2651,7 @@
         <w:pStyle w:val="Compact"/>
         <w:numPr>
           <w:ilvl w:val="0"/>
-          <w:numId w:val="1001"/>
+          <w:numId w:val="1005"/>
         </w:numPr>
       </w:pPr>
       <w:r>
@@ -2284,7 +2727,7 @@
         <w:pStyle w:val="Compact"/>
         <w:numPr>
           <w:ilvl w:val="0"/>
-          <w:numId w:val="1001"/>
+          <w:numId w:val="1005"/>
         </w:numPr>
       </w:pPr>
       <w:r>
@@ -3165,14 +3608,14 @@
         <w:t xml:space="preserve">이면 실제 네트워크가 이미 Pareto 최적이고, 값이 클수록 같은 제약 하에서 개선 여지가 크다.</w:t>
       </w:r>
     </w:p>
-    <w:bookmarkEnd w:id="23"/>
-    <w:bookmarkStart w:id="24" w:name="가상-네트워크-합성-stage-6"/>
+    <w:bookmarkEnd w:id="27"/>
+    <w:bookmarkStart w:id="28" w:name="가상-네트워크-합성-stage-6"/>
     <w:p>
       <w:pPr>
         <w:pStyle w:val="Heading1"/>
       </w:pPr>
       <w:r>
-        <w:t xml:space="preserve">4. 가상 네트워크 합성 (Stage 6)</w:t>
+        <w:t xml:space="preserve">5. 가상 네트워크 합성 (Stage 6)</w:t>
       </w:r>
     </w:p>
     <w:p>
@@ -3362,14 +3805,14 @@
         <w:t>은 “모든 지표가 top-1000 벤치마크 달성”을 뜻한다. 시드 아키타입은 gridded / organic(Delaunay) / hybrid 3종.</w:t>
       </w:r>
     </w:p>
-    <w:bookmarkEnd w:id="24"/>
-    <w:bookmarkStart w:id="25" w:name="gnn-서로게이트-stage-7"/>
+    <w:bookmarkEnd w:id="28"/>
+    <w:bookmarkStart w:id="29" w:name="gnn-서로게이트-stage-7"/>
     <w:p>
       <w:pPr>
         <w:pStyle w:val="Heading1"/>
       </w:pPr>
       <w:r>
-        <w:t xml:space="preserve">5. GNN 서로게이트 (Stage 7)</w:t>
+        <w:t xml:space="preserve">6. GNN 서로게이트 (Stage 7)</w:t>
       </w:r>
     </w:p>
     <w:p>
@@ -3399,7 +3842,7 @@
         <w:pStyle w:val="Compact"/>
         <w:numPr>
           <w:ilvl w:val="0"/>
-          <w:numId w:val="1002"/>
+          <w:numId w:val="1006"/>
         </w:numPr>
       </w:pPr>
       <w:r>
@@ -3520,7 +3963,7 @@
         <w:pStyle w:val="Compact"/>
         <w:numPr>
           <w:ilvl w:val="0"/>
-          <w:numId w:val="1002"/>
+          <w:numId w:val="1006"/>
         </w:numPr>
       </w:pPr>
       <w:r>
@@ -3532,7 +3975,7 @@
         <w:pStyle w:val="Compact"/>
         <w:numPr>
           <w:ilvl w:val="0"/>
-          <w:numId w:val="1002"/>
+          <w:numId w:val="1006"/>
         </w:numPr>
       </w:pPr>
       <w:r>
@@ -3571,14 +4014,14 @@
         <w:t xml:space="preserve">은 라벨 품질에 의해 상한이 정해진다. 순위상관을 병행 보고한다.</w:t>
       </w:r>
     </w:p>
-    <w:bookmarkEnd w:id="25"/>
-    <w:bookmarkStart w:id="26" w:name="사회경제-상관회귀-분석-stage-8"/>
+    <w:bookmarkEnd w:id="29"/>
+    <w:bookmarkStart w:id="30" w:name="사회경제-상관회귀-분석-stage-8"/>
     <w:p>
       <w:pPr>
         <w:pStyle w:val="Heading1"/>
       </w:pPr>
       <w:r>
-        <w:t xml:space="preserve">6. 사회경제 상관·회귀 분석 (Stage 8)</w:t>
+        <w:t xml:space="preserve">7. 사회경제 상관·회귀 분석 (Stage 8)</w:t>
       </w:r>
     </w:p>
     <w:p>
@@ -4075,7 +4518,7 @@
         <w:t xml:space="preserve">) 관계의 원인을 세 갈래로 추적한다: (1) 노출 검정 — ACS walk-to-work share를 추가 통제했을 때 효과가 소멸하는지, (2) 구성지표 분해 — 6개 지표 중 어느 것이 위험을 담지하는지, (3) 메커니즘 — FARS 보행자 사망 사고를 tract에 결합해 UOI 5분위별로 도로 기능등급, 도시/농촌, 교차로 vs mid-block을 프로파일링.</w:t>
       </w:r>
     </w:p>
-    <w:bookmarkEnd w:id="26"/>
+    <w:bookmarkEnd w:id="30"/>
     <w:sectPr>
       <w:footnotePr>
         <w:numRestart w:val="eachSect"/>
@@ -4289,6 +4732,91 @@
       </w:rPr>
     </w:lvl>
   </w:abstractNum>
+  <w:abstractNum w:abstractNumId="99411">
+    <w:nsid w:val="00A99411"/>
+    <w:multiLevelType w:val="multilevel"/>
+    <w:lvl w:ilvl="0">
+      <w:start w:val="1"/>
+      <w:numFmt w:val="decimal"/>
+      <w:lvlText w:val="%1."/>
+      <w:lvlJc w:val="left"/>
+      <w:pPr>
+        <w:ind w:left="720" w:hanging="360"/>
+      </w:pPr>
+    </w:lvl>
+    <w:lvl w:ilvl="1">
+      <w:start w:val="1"/>
+      <w:numFmt w:val="decimal"/>
+      <w:lvlText w:val="%2."/>
+      <w:lvlJc w:val="left"/>
+      <w:pPr>
+        <w:ind w:left="1440" w:hanging="360"/>
+      </w:pPr>
+    </w:lvl>
+    <w:lvl w:ilvl="2">
+      <w:start w:val="1"/>
+      <w:numFmt w:val="decimal"/>
+      <w:lvlText w:val="%3."/>
+      <w:lvlJc w:val="left"/>
+      <w:pPr>
+        <w:ind w:left="2160" w:hanging="360"/>
+      </w:pPr>
+    </w:lvl>
+    <w:lvl w:ilvl="3">
+      <w:start w:val="1"/>
+      <w:numFmt w:val="decimal"/>
+      <w:lvlText w:val="%4."/>
+      <w:lvlJc w:val="left"/>
+      <w:pPr>
+        <w:ind w:left="2880" w:hanging="360"/>
+      </w:pPr>
+    </w:lvl>
+    <w:lvl w:ilvl="4">
+      <w:start w:val="1"/>
+      <w:numFmt w:val="decimal"/>
+      <w:lvlText w:val="%5."/>
+      <w:lvlJc w:val="left"/>
+      <w:pPr>
+        <w:ind w:left="3600" w:hanging="360"/>
+      </w:pPr>
+    </w:lvl>
+    <w:lvl w:ilvl="5">
+      <w:start w:val="1"/>
+      <w:numFmt w:val="decimal"/>
+      <w:lvlText w:val="%6."/>
+      <w:lvlJc w:val="left"/>
+      <w:pPr>
+        <w:ind w:left="4320" w:hanging="360"/>
+      </w:pPr>
+    </w:lvl>
+    <w:lvl w:ilvl="6">
+      <w:start w:val="1"/>
+      <w:numFmt w:val="decimal"/>
+      <w:lvlText w:val="%7."/>
+      <w:lvlJc w:val="left"/>
+      <w:pPr>
+        <w:ind w:left="5040" w:hanging="360"/>
+      </w:pPr>
+    </w:lvl>
+    <w:lvl w:ilvl="7">
+      <w:start w:val="1"/>
+      <w:numFmt w:val="decimal"/>
+      <w:lvlText w:val="%8."/>
+      <w:lvlJc w:val="left"/>
+      <w:pPr>
+        <w:ind w:left="5760" w:hanging="360"/>
+      </w:pPr>
+    </w:lvl>
+    <w:lvl w:ilvl="8">
+      <w:start w:val="1"/>
+      <w:numFmt w:val="decimal"/>
+      <w:lvlText w:val="%9."/>
+      <w:lvlJc w:val="left"/>
+      <w:pPr>
+        <w:ind w:left="6480" w:hanging="360"/>
+      </w:pPr>
+    </w:lvl>
+  </w:abstractNum>
   <w:num w:numId="1000">
     <w:abstractNumId w:val="990"/>
   </w:num>
@@ -4296,6 +4824,45 @@
     <w:abstractNumId w:val="991"/>
   </w:num>
   <w:num w:numId="1002">
+    <w:abstractNumId w:val="991"/>
+  </w:num>
+  <w:num w:numId="1003">
+    <w:abstractNumId w:val="99411"/>
+    <w:lvlOverride w:ilvl="0">
+      <w:startOverride w:val="1"/>
+    </w:lvlOverride>
+    <w:lvlOverride w:ilvl="1">
+      <w:startOverride w:val="1"/>
+    </w:lvlOverride>
+    <w:lvlOverride w:ilvl="2">
+      <w:startOverride w:val="1"/>
+    </w:lvlOverride>
+    <w:lvlOverride w:ilvl="3">
+      <w:startOverride w:val="1"/>
+    </w:lvlOverride>
+    <w:lvlOverride w:ilvl="4">
+      <w:startOverride w:val="1"/>
+    </w:lvlOverride>
+    <w:lvlOverride w:ilvl="5">
+      <w:startOverride w:val="1"/>
+    </w:lvlOverride>
+    <w:lvlOverride w:ilvl="6">
+      <w:startOverride w:val="1"/>
+    </w:lvlOverride>
+    <w:lvlOverride w:ilvl="7">
+      <w:startOverride w:val="1"/>
+    </w:lvlOverride>
+    <w:lvlOverride w:ilvl="8">
+      <w:startOverride w:val="1"/>
+    </w:lvlOverride>
+  </w:num>
+  <w:num w:numId="1004">
+    <w:abstractNumId w:val="991"/>
+  </w:num>
+  <w:num w:numId="1005">
+    <w:abstractNumId w:val="991"/>
+  </w:num>
+  <w:num w:numId="1006">
     <w:abstractNumId w:val="991"/>
   </w:num>
 </w:numbering>

</xml_diff>